<commit_message>
Lafond Parte 5: revisão
Co-Authored-By: Claude Opus 5.5 <noreply@anthropic.com>
Claude-Session: https://claude.ai/code/session_01MJjUEEZrxQDEUifKK2vj9g
</commit_message>
<xml_diff>
--- a/roteiros/jorge-lafond/Lafond_Parte5.docx
+++ b/roteiros/jorge-lafond/Lafond_Parte5.docx
@@ -79,7 +79,7 @@
         <w:rPr>
           <w:color w:val="000000"/>
         </w:rPr>
-        <w:t>Em dois mil e dezoito, a sepultura estava vazia. As joias tinham sumido. Segundo Padula, ele nunca foi avisado, e nenhuma transferência aparecia no sistema.</w:t>
+        <w:t>Em dois mil e dezoito, segundo Padula, a sepultura estava vazia e as joias tinham sumido. Ele nunca foi avisado, e nenhuma transferência aparecia no sistema.</w:t>
       </w:r>
     </w:p>
     <w:p>
@@ -87,7 +87,7 @@
         <w:rPr>
           <w:color w:val="000000"/>
         </w:rPr>
-        <w:t>Em cemitérios públicos, é comum que restos mortais sejam retirados da sepultura depois de alguns anos e levados para outro lugar.</w:t>
+        <w:t>Nos cemitérios públicos do Brasil, é comum que restos mortais sejam retirados da sepultura depois de alguns anos e levados para outro lugar.</w:t>
       </w:r>
     </w:p>
     <w:p>
@@ -111,7 +111,7 @@
         <w:rPr>
           <w:color w:val="000000"/>
         </w:rPr>
-        <w:t>Hoje, quem vai a Irajá para levar uma flor para a Vera Verão não tem onde deixar.</w:t>
+        <w:t>Hoje, quem vai a Irajá para levar uma flor para a Vera Verão não tem um túmulo onde deixar.</w:t>
       </w:r>
     </w:p>
     <w:p>
@@ -135,7 +135,7 @@
         <w:rPr>
           <w:color w:val="000000"/>
         </w:rPr>
-        <w:t>Durante anos, o nome de Jorge Lafond ficou restrito a vídeos antigos na internet e a uma ou outra matéria de aniversário de morte.</w:t>
+        <w:t>Durante anos, o nome de Jorge Lafond só aparecia de vez em quando, em notícias sobre a briga pela herança.</w:t>
       </w:r>
     </w:p>
     <w:p>
@@ -327,7 +327,7 @@
         <w:rPr>
           <w:color w:val="000000"/>
         </w:rPr>
-        <w:t>Morreu com milhões de fãs e quase ninguém por perto.</w:t>
+        <w:t>Morreu com milhões de fãs e poucas pessoas por perto.</w:t>
       </w:r>
     </w:p>
     <w:p>

</xml_diff>